<commit_message>
Update project report with Streamlit dashboard screenshots
</commit_message>
<xml_diff>
--- a/MohanKumarM_ProjectReport.docx
+++ b/MohanKumarM_ProjectReport.docx
@@ -164,7 +164,320 @@
           <w:color w:val="1E3A8A"/>
           <w:sz w:val="30"/>
         </w:rPr>
-        <w:t>4. Problem Statement</w:t>
+        <w:t>4. Project Output - Implemented Streamlit Dashboard</w:t>
+      </w:r>
+    </w:p>
+    <w:p>
+      <w:pPr>
+        <w:spacing w:after="120" w:line="276" w:lineRule="auto"/>
+      </w:pPr>
+      <w:r>
+        <w:rPr>
+          <w:rFonts w:ascii="Arial" w:hAnsi="Arial"/>
+          <w:color w:val="1E293B"/>
+          <w:sz w:val="21"/>
+        </w:rPr>
+        <w:t>To bridge advanced computational modeling with daily banking marketing operations, the entire analytical and predictive workflow developed in this project was implemented as a production-grade, interactive web dashboard using Streamlit. This section presents the actual graphical user interface and functional outputs generated by the running application, providing the evaluator with direct visual evidence of the implemented system prior to the detailed technical chapters.</w:t>
+      </w:r>
+    </w:p>
+    <w:p>
+      <w:pPr>
+        <w:pStyle w:val="Heading2"/>
+        <w:keepNext/>
+        <w:spacing w:before="240" w:after="80"/>
+      </w:pPr>
+      <w:r>
+        <w:rPr>
+          <w:rFonts w:ascii="Arial" w:hAnsi="Arial"/>
+          <w:b/>
+          <w:color w:val="0F766E"/>
+          <w:sz w:val="25"/>
+        </w:rPr>
+        <w:t>4.1 Executive Dashboard Overview and Campaign KPIs</w:t>
+      </w:r>
+    </w:p>
+    <w:p>
+      <w:pPr>
+        <w:keepNext/>
+        <w:spacing w:before="160" w:after="80"/>
+        <w:jc w:val="center"/>
+      </w:pPr>
+      <w:r>
+        <w:drawing>
+          <wp:inline xmlns:a="http://schemas.openxmlformats.org/drawingml/2006/main" xmlns:pic="http://schemas.openxmlformats.org/drawingml/2006/picture">
+            <wp:extent cx="5303520" cy="2522280"/>
+            <wp:docPr id="1" name="Picture 1"/>
+            <wp:cNvGraphicFramePr>
+              <a:graphicFrameLocks noChangeAspect="1"/>
+            </wp:cNvGraphicFramePr>
+            <a:graphic>
+              <a:graphicData uri="http://schemas.openxmlformats.org/drawingml/2006/picture">
+                <pic:pic>
+                  <pic:nvPicPr>
+                    <pic:cNvPr id="0" name="media_1790084670708.png"/>
+                    <pic:cNvPicPr/>
+                  </pic:nvPicPr>
+                  <pic:blipFill>
+                    <a:blip r:embed="rId11"/>
+                    <a:stretch>
+                      <a:fillRect/>
+                    </a:stretch>
+                  </pic:blipFill>
+                  <pic:spPr>
+                    <a:xfrm>
+                      <a:off x="0" y="0"/>
+                      <a:ext cx="5303520" cy="2522280"/>
+                    </a:xfrm>
+                    <a:prstGeom prst="rect"/>
+                  </pic:spPr>
+                </pic:pic>
+              </a:graphicData>
+            </a:graphic>
+          </wp:inline>
+        </w:drawing>
+      </w:r>
+    </w:p>
+    <w:p>
+      <w:pPr>
+        <w:spacing w:after="240"/>
+        <w:jc w:val="center"/>
+      </w:pPr>
+      <w:r>
+        <w:rPr>
+          <w:rFonts w:ascii="Arial" w:hAnsi="Arial"/>
+          <w:i/>
+          <w:color w:val="64748B"/>
+          <w:sz w:val="18"/>
+        </w:rPr>
+        <w:t>Figure 1: Implemented Streamlit Dashboard - Executive Overview, Core KPIs, and Category Distributions</w:t>
+      </w:r>
+    </w:p>
+    <w:p>
+      <w:pPr>
+        <w:spacing w:after="120" w:line="276" w:lineRule="auto"/>
+      </w:pPr>
+      <w:r>
+        <w:rPr>
+          <w:rFonts w:ascii="Arial" w:hAnsi="Arial"/>
+          <w:color w:val="1E293B"/>
+          <w:sz w:val="21"/>
+        </w:rPr>
+        <w:t>Figure 1 displays the primary 'Executive Dashboard &amp; KPIs' view of the implemented Streamlit application. The navigation sidebar on the left confirms the project credentials (Student: Mohan Kumar M, Program: AICTE | IBM SkillsBuild 2026, Partner: BharatCares) and allows switching between analytical modules. The main console displays five real-time Key Performance Indicator (KPI) cards: Total Contacts (4,521), Term Deposit Subscriptions (521), Overall Conversion Rate (11.52%), Mean Customer Account Balance (EUR 1,423), and Median Balance (EUR 444). Below the KPI cards, the interface presents two comparative visualizations: the target variable distribution showing 4,000 non-subscribers (88.5%) versus 521 subscribers (11.5%), and a horizontal bar chart displaying subscription rates across job categories benchmarked against the 11.5% campaign baseline.</w:t>
+      </w:r>
+    </w:p>
+    <w:p>
+      <w:pPr>
+        <w:pStyle w:val="Heading2"/>
+        <w:keepNext/>
+        <w:spacing w:before="240" w:after="80"/>
+      </w:pPr>
+      <w:r>
+        <w:rPr>
+          <w:rFonts w:ascii="Arial" w:hAnsi="Arial"/>
+          <w:b/>
+          <w:color w:val="0F766E"/>
+          <w:sz w:val="25"/>
+        </w:rPr>
+        <w:t>4.2 Core Behavioral Drivers and Liability Impact Analysis</w:t>
+      </w:r>
+    </w:p>
+    <w:p>
+      <w:pPr>
+        <w:keepNext/>
+        <w:spacing w:before="160" w:after="80"/>
+        <w:jc w:val="center"/>
+      </w:pPr>
+      <w:r>
+        <w:drawing>
+          <wp:inline xmlns:a="http://schemas.openxmlformats.org/drawingml/2006/main" xmlns:pic="http://schemas.openxmlformats.org/drawingml/2006/picture">
+            <wp:extent cx="5303520" cy="2315111"/>
+            <wp:docPr id="2" name="Picture 2"/>
+            <wp:cNvGraphicFramePr>
+              <a:graphicFrameLocks noChangeAspect="1"/>
+            </wp:cNvGraphicFramePr>
+            <a:graphic>
+              <a:graphicData uri="http://schemas.openxmlformats.org/drawingml/2006/picture">
+                <pic:pic>
+                  <pic:nvPicPr>
+                    <pic:cNvPr id="0" name="media_1790084693944.png"/>
+                    <pic:cNvPicPr/>
+                  </pic:nvPicPr>
+                  <pic:blipFill>
+                    <a:blip r:embed="rId12"/>
+                    <a:stretch>
+                      <a:fillRect/>
+                    </a:stretch>
+                  </pic:blipFill>
+                  <pic:spPr>
+                    <a:xfrm>
+                      <a:off x="0" y="0"/>
+                      <a:ext cx="5303520" cy="2315111"/>
+                    </a:xfrm>
+                    <a:prstGeom prst="rect"/>
+                  </pic:spPr>
+                </pic:pic>
+              </a:graphicData>
+            </a:graphic>
+          </wp:inline>
+        </w:drawing>
+      </w:r>
+    </w:p>
+    <w:p>
+      <w:pPr>
+        <w:spacing w:after="240"/>
+        <w:jc w:val="center"/>
+      </w:pPr>
+      <w:r>
+        <w:rPr>
+          <w:rFonts w:ascii="Arial" w:hAnsi="Arial"/>
+          <w:i/>
+          <w:color w:val="64748B"/>
+          <w:sz w:val="18"/>
+        </w:rPr>
+        <w:t>Figure 2: Implemented Streamlit Dashboard - Core Behavioral Drivers and Loan Liabilities View</w:t>
+      </w:r>
+    </w:p>
+    <w:p>
+      <w:pPr>
+        <w:spacing w:after="120" w:line="276" w:lineRule="auto"/>
+      </w:pPr>
+      <w:r>
+        <w:rPr>
+          <w:rFonts w:ascii="Arial" w:hAnsi="Arial"/>
+          <w:color w:val="1E293B"/>
+          <w:sz w:val="21"/>
+        </w:rPr>
+        <w:t>Figure 2 illustrates the 'Core Behavioral Drivers' module within the dashboard. The left panel visualizes conversion yields across historical outreach outcomes ('poutcome'), highlighting that clients who converted in a previous campaign achieved a 64.3% subscription rate - nearly six times the baseline rate (indicated by the red dashed reference line). The right panel isolates the impact of debt liabilities, showing that clients servicing housing mortgages converted at only 8.6% (compared to 15.3% for debt-free clients) and personal loan commitments reduced conversion to 6.2% (compared to 12.5% without personal loans).</w:t>
+      </w:r>
+    </w:p>
+    <w:p>
+      <w:pPr>
+        <w:pStyle w:val="Heading2"/>
+        <w:keepNext/>
+        <w:spacing w:before="240" w:after="80"/>
+      </w:pPr>
+      <w:r>
+        <w:rPr>
+          <w:rFonts w:ascii="Arial" w:hAnsi="Arial"/>
+          <w:b/>
+          <w:color w:val="0F766E"/>
+          <w:sz w:val="25"/>
+        </w:rPr>
+        <w:t>4.3 Interactive Customer Segment Explorer</w:t>
+      </w:r>
+    </w:p>
+    <w:p>
+      <w:pPr>
+        <w:keepNext/>
+        <w:spacing w:before="160" w:after="80"/>
+        <w:jc w:val="center"/>
+      </w:pPr>
+      <w:r>
+        <w:drawing>
+          <wp:inline xmlns:a="http://schemas.openxmlformats.org/drawingml/2006/main" xmlns:pic="http://schemas.openxmlformats.org/drawingml/2006/picture">
+            <wp:extent cx="5303520" cy="2351365"/>
+            <wp:docPr id="3" name="Picture 3"/>
+            <wp:cNvGraphicFramePr>
+              <a:graphicFrameLocks noChangeAspect="1"/>
+            </wp:cNvGraphicFramePr>
+            <a:graphic>
+              <a:graphicData uri="http://schemas.openxmlformats.org/drawingml/2006/picture">
+                <pic:pic>
+                  <pic:nvPicPr>
+                    <pic:cNvPr id="0" name="media_1790084715808.png"/>
+                    <pic:cNvPicPr/>
+                  </pic:nvPicPr>
+                  <pic:blipFill>
+                    <a:blip r:embed="rId13"/>
+                    <a:stretch>
+                      <a:fillRect/>
+                    </a:stretch>
+                  </pic:blipFill>
+                  <pic:spPr>
+                    <a:xfrm>
+                      <a:off x="0" y="0"/>
+                      <a:ext cx="5303520" cy="2351365"/>
+                    </a:xfrm>
+                    <a:prstGeom prst="rect"/>
+                  </pic:spPr>
+                </pic:pic>
+              </a:graphicData>
+            </a:graphic>
+          </wp:inline>
+        </w:drawing>
+      </w:r>
+    </w:p>
+    <w:p>
+      <w:pPr>
+        <w:spacing w:after="240"/>
+        <w:jc w:val="center"/>
+      </w:pPr>
+      <w:r>
+        <w:rPr>
+          <w:rFonts w:ascii="Arial" w:hAnsi="Arial"/>
+          <w:i/>
+          <w:color w:val="64748B"/>
+          <w:sz w:val="18"/>
+        </w:rPr>
+        <w:t>Figure 3: Implemented Streamlit Dashboard - Interactive Customer Segment Explorer and Dynamic Data Filter</w:t>
+      </w:r>
+    </w:p>
+    <w:p>
+      <w:pPr>
+        <w:spacing w:after="120" w:line="276" w:lineRule="auto"/>
+      </w:pPr>
+      <w:r>
+        <w:rPr>
+          <w:rFonts w:ascii="Arial" w:hAnsi="Arial"/>
+          <w:color w:val="1E293B"/>
+          <w:sz w:val="21"/>
+        </w:rPr>
+        <w:t>Figure 3 demonstrates the 'Interactive Customer Segment Explorer' interface. Marketing managers can dynamically select and combine customer attributes through multi-select dropdown filters (including Job Types, Education Levels, and Housing Loan status). Upon adjusting filters, the dashboard instantly recalculates the Segment Size, Segment Subscriptions, and Segment Conversion Rate (with delta indicator relative to baseline), and dynamically filters the underlying tabular customer records for granular verification.</w:t>
+      </w:r>
+    </w:p>
+    <w:p>
+      <w:pPr>
+        <w:pStyle w:val="Heading2"/>
+        <w:keepNext/>
+        <w:spacing w:before="240" w:after="80"/>
+      </w:pPr>
+      <w:r>
+        <w:rPr>
+          <w:rFonts w:ascii="Arial" w:hAnsi="Arial"/>
+          <w:b/>
+          <w:color w:val="0F766E"/>
+          <w:sz w:val="25"/>
+        </w:rPr>
+        <w:t>4.4 Operational Significance of the Dashboard</w:t>
+      </w:r>
+    </w:p>
+    <w:p>
+      <w:pPr>
+        <w:spacing w:after="120" w:line="276" w:lineRule="auto"/>
+      </w:pPr>
+      <w:r>
+        <w:rPr>
+          <w:rFonts w:ascii="Arial" w:hAnsi="Arial"/>
+          <w:color w:val="1E293B"/>
+          <w:sz w:val="21"/>
+        </w:rPr>
+        <w:t>The implemented Streamlit application serves as an interactive decision-support cockpit for bank marketing teams and executive leadership. It operationalizes the data analysis findings by providing an accessible, real-time interface for: (1) tracking top-line campaign performance metrics and class distributions at a glance; (2) diagnosing critical behavioral drivers and the restrictive impact of existing credit commitments; (3) dynamically segmenting customer cohorts to estimate campaign yields before deploying outreach resources; and (4) serving as an intuitive front-end for pre-contact lead qualification without exposing non-technical staff to raw code. Crucially, the dashboard maintains strict methodological governance by excluding post-contact duration from prospective scoring.</w:t>
+      </w:r>
+    </w:p>
+    <w:p>
+      <w:pPr>
+        <w:pStyle w:val="Heading1"/>
+        <w:keepNext/>
+        <w:spacing w:before="360" w:after="120"/>
+      </w:pPr>
+      <w:r>
+        <w:rPr>
+          <w:rFonts w:ascii="Arial" w:hAnsi="Arial"/>
+          <w:b/>
+          <w:color w:val="1E3A8A"/>
+          <w:sz w:val="30"/>
+        </w:rPr>
+        <w:t>5. Problem Statement</w:t>
       </w:r>
     </w:p>
     <w:p>
@@ -193,7 +506,7 @@
           <w:color w:val="1E3A8A"/>
           <w:sz w:val="30"/>
         </w:rPr>
-        <w:t>5. Objectives</w:t>
+        <w:t>6. Objectives</w:t>
       </w:r>
     </w:p>
     <w:p>
@@ -347,7 +660,7 @@
           <w:color w:val="1E3A8A"/>
           <w:sz w:val="30"/>
         </w:rPr>
-        <w:t>6. Business Context</w:t>
+        <w:t>7. Business Context</w:t>
       </w:r>
     </w:p>
     <w:p>
@@ -376,7 +689,7 @@
           <w:color w:val="1E3A8A"/>
           <w:sz w:val="30"/>
         </w:rPr>
-        <w:t>7. Dataset Description</w:t>
+        <w:t>8. Dataset Description</w:t>
       </w:r>
     </w:p>
     <w:p>
@@ -405,7 +718,7 @@
           <w:color w:val="1E3A8A"/>
           <w:sz w:val="30"/>
         </w:rPr>
-        <w:t>8. Data Dictionary</w:t>
+        <w:t>9. Data Dictionary</w:t>
       </w:r>
     </w:p>
     <w:p>
@@ -864,7 +1177,7 @@
                 <w:color w:val="1E293B"/>
                 <w:sz w:val="18"/>
               </w:rPr>
-              <w:t>Average yearly balance in euros (€).</w:t>
+              <w:t>Average yearly balance in euros (EUR).</w:t>
             </w:r>
           </w:p>
         </w:tc>
@@ -1565,7 +1878,7 @@
           <w:color w:val="1E3A8A"/>
           <w:sz w:val="30"/>
         </w:rPr>
-        <w:t>9. Methodology</w:t>
+        <w:t>10. Methodology</w:t>
       </w:r>
     </w:p>
     <w:p>
@@ -1593,7 +1906,7 @@
           <w:color w:val="0F172A"/>
           <w:sz w:val="20"/>
         </w:rPr>
-        <w:t>Phase 1 — Ingestion &amp; Auditing:</w:t>
+        <w:t>Phase 1 - Ingestion &amp; Auditing:</w:t>
       </w:r>
       <w:r>
         <w:rPr>
@@ -1616,7 +1929,7 @@
           <w:color w:val="0F172A"/>
           <w:sz w:val="20"/>
         </w:rPr>
-        <w:t>Phase 2 — Exploratory Analytics:</w:t>
+        <w:t>Phase 2 - Exploratory Analytics:</w:t>
       </w:r>
       <w:r>
         <w:rPr>
@@ -1639,7 +1952,7 @@
           <w:color w:val="0F172A"/>
           <w:sz w:val="20"/>
         </w:rPr>
-        <w:t>Phase 3 — KPI Formalization:</w:t>
+        <w:t>Phase 3 - KPI Formalization:</w:t>
       </w:r>
       <w:r>
         <w:rPr>
@@ -1662,7 +1975,7 @@
           <w:color w:val="0F172A"/>
           <w:sz w:val="20"/>
         </w:rPr>
-        <w:t>Phase 4 — Domain Feature Engineering:</w:t>
+        <w:t>Phase 4 - Domain Feature Engineering:</w:t>
       </w:r>
       <w:r>
         <w:rPr>
@@ -1685,7 +1998,7 @@
           <w:color w:val="0F172A"/>
           <w:sz w:val="20"/>
         </w:rPr>
-        <w:t>Phase 5 — Leakage Assessment:</w:t>
+        <w:t>Phase 5 - Leakage Assessment:</w:t>
       </w:r>
       <w:r>
         <w:rPr>
@@ -1708,7 +2021,7 @@
           <w:color w:val="0F172A"/>
           <w:sz w:val="20"/>
         </w:rPr>
-        <w:t>Phase 6 — Pipeline Assembly &amp; Training:</w:t>
+        <w:t>Phase 6 - Pipeline Assembly &amp; Training:</w:t>
       </w:r>
       <w:r>
         <w:rPr>
@@ -1731,7 +2044,7 @@
           <w:color w:val="0F172A"/>
           <w:sz w:val="20"/>
         </w:rPr>
-        <w:t>Phase 7 — Model Evaluation &amp; Interpretation:</w:t>
+        <w:t>Phase 7 - Model Evaluation &amp; Interpretation:</w:t>
       </w:r>
       <w:r>
         <w:rPr>
@@ -1754,7 +2067,7 @@
           <w:color w:val="0F172A"/>
           <w:sz w:val="20"/>
         </w:rPr>
-        <w:t>Phase 8 — Managerial Recommendations:</w:t>
+        <w:t>Phase 8 - Managerial Recommendations:</w:t>
       </w:r>
       <w:r>
         <w:rPr>
@@ -1778,7 +2091,7 @@
           <w:color w:val="1E3A8A"/>
           <w:sz w:val="30"/>
         </w:rPr>
-        <w:t>10. Data Preprocessing</w:t>
+        <w:t>11. Data Preprocessing</w:t>
       </w:r>
     </w:p>
     <w:p>
@@ -1899,7 +2212,7 @@
           <w:color w:val="1E3A8A"/>
           <w:sz w:val="30"/>
         </w:rPr>
-        <w:t>11. Exploratory Data Analysis</w:t>
+        <w:t>12. Exploratory Data Analysis</w:t>
       </w:r>
     </w:p>
     <w:p>
@@ -1928,7 +2241,7 @@
           <w:color w:val="0F766E"/>
           <w:sz w:val="25"/>
         </w:rPr>
-        <w:t>11.1 Target Distribution and Class Imbalance</w:t>
+        <w:t>12.1 Target Distribution and Class Imbalance</w:t>
       </w:r>
     </w:p>
     <w:p>
@@ -1941,7 +2254,7 @@
         <w:drawing>
           <wp:inline xmlns:a="http://schemas.openxmlformats.org/drawingml/2006/main" xmlns:pic="http://schemas.openxmlformats.org/drawingml/2006/picture">
             <wp:extent cx="5303520" cy="3788229"/>
-            <wp:docPr id="1" name="Picture 1"/>
+            <wp:docPr id="4" name="Picture 4"/>
             <wp:cNvGraphicFramePr>
               <a:graphicFrameLocks noChangeAspect="1"/>
             </wp:cNvGraphicFramePr>
@@ -1953,7 +2266,7 @@
                     <pic:cNvPicPr/>
                   </pic:nvPicPr>
                   <pic:blipFill>
-                    <a:blip r:embed="rId11"/>
+                    <a:blip r:embed="rId14"/>
                     <a:stretch>
                       <a:fillRect/>
                     </a:stretch>
@@ -1984,7 +2297,7 @@
           <w:color w:val="64748B"/>
           <w:sz w:val="18"/>
         </w:rPr>
-        <w:t>Figure 1: Target Variable Distribution (y)</w:t>
+        <w:t>Figure 4: Target Variable Distribution (y)</w:t>
       </w:r>
     </w:p>
     <w:p>
@@ -1997,7 +2310,7 @@
           <w:color w:val="1E293B"/>
           <w:sz w:val="21"/>
         </w:rPr>
-        <w:t>As illustrated in Figure 1, the target variable exhibits significant class imbalance. Out of 4,521 contacts, 4,000 clients (88.48%) declined or failed to subscribe, while 521 clients (11.52%) subscribed to a term deposit. This 8:1 imbalance requires class-weighted loss functions and evaluation metrics sensitive to minority recall, such as ROC-AUC, Precision, and Recall, rather than raw classification accuracy.</w:t>
+        <w:t>As illustrated in Figure 4, the target variable exhibits significant class imbalance. Out of 4,521 contacts, 4,000 clients (88.48%) declined or failed to subscribe, while 521 clients (11.52%) subscribed to a term deposit. This 8:1 imbalance requires class-weighted loss functions and evaluation metrics sensitive to minority recall, such as ROC-AUC, Precision, and Recall, rather than raw classification accuracy.</w:t>
       </w:r>
     </w:p>
     <w:p>
@@ -2013,7 +2326,7 @@
           <w:color w:val="0F766E"/>
           <w:sz w:val="25"/>
         </w:rPr>
-        <w:t>11.2 Subscription Rate by Occupation</w:t>
+        <w:t>12.2 Subscription Rate by Occupation</w:t>
       </w:r>
     </w:p>
     <w:p>
@@ -2026,7 +2339,7 @@
         <w:drawing>
           <wp:inline xmlns:a="http://schemas.openxmlformats.org/drawingml/2006/main" xmlns:pic="http://schemas.openxmlformats.org/drawingml/2006/picture">
             <wp:extent cx="5303520" cy="3182112"/>
-            <wp:docPr id="2" name="Picture 2"/>
+            <wp:docPr id="5" name="Picture 5"/>
             <wp:cNvGraphicFramePr>
               <a:graphicFrameLocks noChangeAspect="1"/>
             </wp:cNvGraphicFramePr>
@@ -2038,7 +2351,7 @@
                     <pic:cNvPicPr/>
                   </pic:nvPicPr>
                   <pic:blipFill>
-                    <a:blip r:embed="rId12"/>
+                    <a:blip r:embed="rId15"/>
                     <a:stretch>
                       <a:fillRect/>
                     </a:stretch>
@@ -2069,7 +2382,7 @@
           <w:color w:val="64748B"/>
           <w:sz w:val="18"/>
         </w:rPr>
-        <w:t>Figure 2: Subscription Rate Across Job Categories</w:t>
+        <w:t>Figure 5: Subscription Rate Across Job Categories</w:t>
       </w:r>
     </w:p>
     <w:p>
@@ -2082,7 +2395,7 @@
           <w:color w:val="1E293B"/>
           <w:sz w:val="21"/>
         </w:rPr>
-        <w:t>Figure 2 highlights significant variation across occupations. The highest conversion rates were observed among students (22.6%) and retirees (23.5%), both converting at more than double the 11.5% campaign baseline. In contrast, blue-collar workers (7.3%) and entrepreneurs (8.9%) showed the lowest response rates. Retirees often seek safe, low-risk capital preservation, whereas blue-collar workers and entrepreneurs frequently direct cash flows into working capital or debt servicing.</w:t>
+        <w:t>Figure 5 highlights significant variation across occupations. The highest conversion rates were observed among students (22.6%) and retirees (23.5%), both converting at more than double the 11.5% campaign baseline. In contrast, blue-collar workers (7.3%) and entrepreneurs (8.9%) showed the lowest response rates. Retirees often seek safe, low-risk capital preservation, whereas blue-collar workers and entrepreneurs frequently direct cash flows into working capital or debt servicing.</w:t>
       </w:r>
     </w:p>
     <w:p>
@@ -2098,7 +2411,7 @@
           <w:color w:val="0F766E"/>
           <w:sz w:val="25"/>
         </w:rPr>
-        <w:t>11.3 Subscription Rate by Education Level</w:t>
+        <w:t>12.3 Subscription Rate by Education Level</w:t>
       </w:r>
     </w:p>
     <w:p>
@@ -2111,7 +2424,7 @@
         <w:drawing>
           <wp:inline xmlns:a="http://schemas.openxmlformats.org/drawingml/2006/main" xmlns:pic="http://schemas.openxmlformats.org/drawingml/2006/picture">
             <wp:extent cx="5303520" cy="3788229"/>
-            <wp:docPr id="3" name="Picture 3"/>
+            <wp:docPr id="6" name="Picture 6"/>
             <wp:cNvGraphicFramePr>
               <a:graphicFrameLocks noChangeAspect="1"/>
             </wp:cNvGraphicFramePr>
@@ -2123,7 +2436,7 @@
                     <pic:cNvPicPr/>
                   </pic:nvPicPr>
                   <pic:blipFill>
-                    <a:blip r:embed="rId13"/>
+                    <a:blip r:embed="rId16"/>
                     <a:stretch>
                       <a:fillRect/>
                     </a:stretch>
@@ -2154,7 +2467,7 @@
           <w:color w:val="64748B"/>
           <w:sz w:val="18"/>
         </w:rPr>
-        <w:t>Figure 3: Subscription Rate by Educational Attainment</w:t>
+        <w:t>Figure 6: Subscription Rate by Educational Attainment</w:t>
       </w:r>
     </w:p>
     <w:p>
@@ -2167,7 +2480,7 @@
           <w:color w:val="1E293B"/>
           <w:sz w:val="21"/>
         </w:rPr>
-        <w:t>Figure 3 demonstrates that clients with tertiary education achieved an observed conversion rate of 14.3%, compared to 10.7% for secondary education and 9.4% for primary education. Higher educational attainment is typically correlated with financial literacy and greater familiarity with fixed-income instruments.</w:t>
+        <w:t>Figure 6 demonstrates that clients with tertiary education achieved an observed conversion rate of 14.3%, compared to 10.7% for secondary education and 9.4% for primary education. Higher educational attainment is typically correlated with financial literacy and greater familiarity with fixed-income instruments.</w:t>
       </w:r>
     </w:p>
     <w:p>
@@ -2183,7 +2496,7 @@
           <w:color w:val="0F766E"/>
           <w:sz w:val="25"/>
         </w:rPr>
-        <w:t>11.4 Impact of Credit Liabilities</w:t>
+        <w:t>12.4 Impact of Credit Liabilities</w:t>
       </w:r>
     </w:p>
     <w:p>
@@ -2196,7 +2509,7 @@
         <w:drawing>
           <wp:inline xmlns:a="http://schemas.openxmlformats.org/drawingml/2006/main" xmlns:pic="http://schemas.openxmlformats.org/drawingml/2006/picture">
             <wp:extent cx="5303520" cy="2506291"/>
-            <wp:docPr id="4" name="Picture 4"/>
+            <wp:docPr id="7" name="Picture 7"/>
             <wp:cNvGraphicFramePr>
               <a:graphicFrameLocks noChangeAspect="1"/>
             </wp:cNvGraphicFramePr>
@@ -2208,7 +2521,7 @@
                     <pic:cNvPicPr/>
                   </pic:nvPicPr>
                   <pic:blipFill>
-                    <a:blip r:embed="rId14"/>
+                    <a:blip r:embed="rId17"/>
                     <a:stretch>
                       <a:fillRect/>
                     </a:stretch>
@@ -2239,7 +2552,7 @@
           <w:color w:val="64748B"/>
           <w:sz w:val="18"/>
         </w:rPr>
-        <w:t>Figure 4: Subscription Rate by Housing and Personal Loan Commitments</w:t>
+        <w:t>Figure 7: Subscription Rate by Housing and Personal Loan Commitments</w:t>
       </w:r>
     </w:p>
     <w:p>
@@ -2252,7 +2565,7 @@
           <w:color w:val="1E293B"/>
           <w:sz w:val="21"/>
         </w:rPr>
-        <w:t>Figure 4 reveals that outstanding liabilities strongly inhibit term deposit subscription. Clients without a housing loan converted at 15.3%, compared to only 8.6% for those with mortgages. Similarly, clients without personal debt converted at 12.5%, compared to 6.7% for clients holding personal loans. Household liquidity committed to servicing debt is unavailable for multi-month deposit commitments.</w:t>
+        <w:t>Figure 7 reveals that outstanding liabilities strongly inhibit term deposit subscription. Clients without a housing loan converted at 15.3%, compared to only 8.6% for those with mortgages. Similarly, clients without personal debt converted at 12.5%, compared to 6.7% for clients holding personal loans. Household liquidity committed to servicing debt is unavailable for multi-month deposit commitments.</w:t>
       </w:r>
     </w:p>
     <w:p>
@@ -2268,262 +2581,7 @@
           <w:color w:val="0F766E"/>
           <w:sz w:val="25"/>
         </w:rPr>
-        <w:t>11.5 Account Balance Distribution</w:t>
-      </w:r>
-    </w:p>
-    <w:p>
-      <w:pPr>
-        <w:keepNext/>
-        <w:spacing w:before="160" w:after="80"/>
-        <w:jc w:val="center"/>
-      </w:pPr>
-      <w:r>
-        <w:drawing>
-          <wp:inline xmlns:a="http://schemas.openxmlformats.org/drawingml/2006/main" xmlns:pic="http://schemas.openxmlformats.org/drawingml/2006/picture">
-            <wp:extent cx="5303520" cy="3314700"/>
-            <wp:docPr id="5" name="Picture 5"/>
-            <wp:cNvGraphicFramePr>
-              <a:graphicFrameLocks noChangeAspect="1"/>
-            </wp:cNvGraphicFramePr>
-            <a:graphic>
-              <a:graphicData uri="http://schemas.openxmlformats.org/drawingml/2006/picture">
-                <pic:pic>
-                  <pic:nvPicPr>
-                    <pic:cNvPr id="0" name="eda_balance_distribution.png"/>
-                    <pic:cNvPicPr/>
-                  </pic:nvPicPr>
-                  <pic:blipFill>
-                    <a:blip r:embed="rId15"/>
-                    <a:stretch>
-                      <a:fillRect/>
-                    </a:stretch>
-                  </pic:blipFill>
-                  <pic:spPr>
-                    <a:xfrm>
-                      <a:off x="0" y="0"/>
-                      <a:ext cx="5303520" cy="3314700"/>
-                    </a:xfrm>
-                    <a:prstGeom prst="rect"/>
-                  </pic:spPr>
-                </pic:pic>
-              </a:graphicData>
-            </a:graphic>
-          </wp:inline>
-        </w:drawing>
-      </w:r>
-    </w:p>
-    <w:p>
-      <w:pPr>
-        <w:spacing w:after="240"/>
-        <w:jc w:val="center"/>
-      </w:pPr>
-      <w:r>
-        <w:rPr>
-          <w:rFonts w:ascii="Arial" w:hAnsi="Arial"/>
-          <w:i/>
-          <w:color w:val="64748B"/>
-          <w:sz w:val="18"/>
-        </w:rPr>
-        <w:t>Figure 5: Account Balance Distribution by Subscription Status</w:t>
-      </w:r>
-    </w:p>
-    <w:p>
-      <w:pPr>
-        <w:spacing w:after="120" w:line="276" w:lineRule="auto"/>
-      </w:pPr>
-      <w:r>
-        <w:rPr>
-          <w:rFonts w:ascii="Arial" w:hAnsi="Arial"/>
-          <w:color w:val="1E293B"/>
-          <w:sz w:val="21"/>
-        </w:rPr>
-        <w:t>Figure 5 depicts the yearly average account balance across subscription outcomes. Subscribed clients displayed higher median balances (€733 vs €417) and larger upper-quartile reserves. Customers maintaining negative or negligible bank balances possess minimal discretionary savings.</w:t>
-      </w:r>
-    </w:p>
-    <w:p>
-      <w:pPr>
-        <w:pStyle w:val="Heading2"/>
-        <w:keepNext/>
-        <w:spacing w:before="240" w:after="80"/>
-      </w:pPr>
-      <w:r>
-        <w:rPr>
-          <w:rFonts w:ascii="Arial" w:hAnsi="Arial"/>
-          <w:b/>
-          <w:color w:val="0F766E"/>
-          <w:sz w:val="25"/>
-        </w:rPr>
-        <w:t>11.6 Campaign Contact Frequency and Outreach Diminishing Returns</w:t>
-      </w:r>
-    </w:p>
-    <w:p>
-      <w:pPr>
-        <w:keepNext/>
-        <w:spacing w:before="160" w:after="80"/>
-        <w:jc w:val="center"/>
-      </w:pPr>
-      <w:r>
-        <w:drawing>
-          <wp:inline xmlns:a="http://schemas.openxmlformats.org/drawingml/2006/main" xmlns:pic="http://schemas.openxmlformats.org/drawingml/2006/picture">
-            <wp:extent cx="5303520" cy="3314700"/>
-            <wp:docPr id="6" name="Picture 6"/>
-            <wp:cNvGraphicFramePr>
-              <a:graphicFrameLocks noChangeAspect="1"/>
-            </wp:cNvGraphicFramePr>
-            <a:graphic>
-              <a:graphicData uri="http://schemas.openxmlformats.org/drawingml/2006/picture">
-                <pic:pic>
-                  <pic:nvPicPr>
-                    <pic:cNvPr id="0" name="eda_campaign_contacts.png"/>
-                    <pic:cNvPicPr/>
-                  </pic:nvPicPr>
-                  <pic:blipFill>
-                    <a:blip r:embed="rId16"/>
-                    <a:stretch>
-                      <a:fillRect/>
-                    </a:stretch>
-                  </pic:blipFill>
-                  <pic:spPr>
-                    <a:xfrm>
-                      <a:off x="0" y="0"/>
-                      <a:ext cx="5303520" cy="3314700"/>
-                    </a:xfrm>
-                    <a:prstGeom prst="rect"/>
-                  </pic:spPr>
-                </pic:pic>
-              </a:graphicData>
-            </a:graphic>
-          </wp:inline>
-        </w:drawing>
-      </w:r>
-    </w:p>
-    <w:p>
-      <w:pPr>
-        <w:spacing w:after="240"/>
-        <w:jc w:val="center"/>
-      </w:pPr>
-      <w:r>
-        <w:rPr>
-          <w:rFonts w:ascii="Arial" w:hAnsi="Arial"/>
-          <w:i/>
-          <w:color w:val="64748B"/>
-          <w:sz w:val="18"/>
-        </w:rPr>
-        <w:t>Figure 6: Subscription Rate by Number of Campaign Contacts</w:t>
-      </w:r>
-    </w:p>
-    <w:p>
-      <w:pPr>
-        <w:spacing w:after="120" w:line="276" w:lineRule="auto"/>
-      </w:pPr>
-      <w:r>
-        <w:rPr>
-          <w:rFonts w:ascii="Arial" w:hAnsi="Arial"/>
-          <w:color w:val="1E293B"/>
-          <w:sz w:val="21"/>
-        </w:rPr>
-        <w:t>Figure 6 illustrates sharp diminishing returns associated with repeated calling. Conversion is highest during the 1st contact (12.3%) and 2nd contact (11.5%), before dropping to under 6% for 5-6 contacts and under 3% beyond 7 contacts. High call frequencies produce customer resistance.</w:t>
-      </w:r>
-    </w:p>
-    <w:p>
-      <w:pPr>
-        <w:pStyle w:val="Heading2"/>
-        <w:keepNext/>
-        <w:spacing w:before="240" w:after="80"/>
-      </w:pPr>
-      <w:r>
-        <w:rPr>
-          <w:rFonts w:ascii="Arial" w:hAnsi="Arial"/>
-          <w:b/>
-          <w:color w:val="0F766E"/>
-          <w:sz w:val="25"/>
-        </w:rPr>
-        <w:t>11.7 Previous Campaign Outcome</w:t>
-      </w:r>
-    </w:p>
-    <w:p>
-      <w:pPr>
-        <w:keepNext/>
-        <w:spacing w:before="160" w:after="80"/>
-        <w:jc w:val="center"/>
-      </w:pPr>
-      <w:r>
-        <w:drawing>
-          <wp:inline xmlns:a="http://schemas.openxmlformats.org/drawingml/2006/main" xmlns:pic="http://schemas.openxmlformats.org/drawingml/2006/picture">
-            <wp:extent cx="5303520" cy="3788229"/>
-            <wp:docPr id="7" name="Picture 7"/>
-            <wp:cNvGraphicFramePr>
-              <a:graphicFrameLocks noChangeAspect="1"/>
-            </wp:cNvGraphicFramePr>
-            <a:graphic>
-              <a:graphicData uri="http://schemas.openxmlformats.org/drawingml/2006/picture">
-                <pic:pic>
-                  <pic:nvPicPr>
-                    <pic:cNvPr id="0" name="eda_poutcome_subscription.png"/>
-                    <pic:cNvPicPr/>
-                  </pic:nvPicPr>
-                  <pic:blipFill>
-                    <a:blip r:embed="rId17"/>
-                    <a:stretch>
-                      <a:fillRect/>
-                    </a:stretch>
-                  </pic:blipFill>
-                  <pic:spPr>
-                    <a:xfrm>
-                      <a:off x="0" y="0"/>
-                      <a:ext cx="5303520" cy="3788229"/>
-                    </a:xfrm>
-                    <a:prstGeom prst="rect"/>
-                  </pic:spPr>
-                </pic:pic>
-              </a:graphicData>
-            </a:graphic>
-          </wp:inline>
-        </w:drawing>
-      </w:r>
-    </w:p>
-    <w:p>
-      <w:pPr>
-        <w:spacing w:after="240"/>
-        <w:jc w:val="center"/>
-      </w:pPr>
-      <w:r>
-        <w:rPr>
-          <w:rFonts w:ascii="Arial" w:hAnsi="Arial"/>
-          <w:i/>
-          <w:color w:val="64748B"/>
-          <w:sz w:val="18"/>
-        </w:rPr>
-        <w:t>Figure 7: Subscription Rate by Previous Campaign Outcome</w:t>
-      </w:r>
-    </w:p>
-    <w:p>
-      <w:pPr>
-        <w:spacing w:after="120" w:line="276" w:lineRule="auto"/>
-      </w:pPr>
-      <w:r>
-        <w:rPr>
-          <w:rFonts w:ascii="Arial" w:hAnsi="Arial"/>
-          <w:color w:val="1E293B"/>
-          <w:sz w:val="21"/>
-        </w:rPr>
-        <w:t>Figure 7 demonstrates that customers whose previous campaign outcome was recorded as 'success' achieved an extraordinary current subscription rate of 64.3%—nearly 6 times the baseline rate. Historical positive engagement is the single strongest indicator of prospective conversion.</w:t>
-      </w:r>
-    </w:p>
-    <w:p>
-      <w:pPr>
-        <w:pStyle w:val="Heading2"/>
-        <w:keepNext/>
-        <w:spacing w:before="240" w:after="80"/>
-      </w:pPr>
-      <w:r>
-        <w:rPr>
-          <w:rFonts w:ascii="Arial" w:hAnsi="Arial"/>
-          <w:b/>
-          <w:color w:val="0F766E"/>
-          <w:sz w:val="25"/>
-        </w:rPr>
-        <w:t>11.8 Duration Analysis and Post-Contact Characteristic</w:t>
+        <w:t>12.5 Account Balance Distribution</w:t>
       </w:r>
     </w:p>
     <w:p>
@@ -2544,7 +2602,7 @@
               <a:graphicData uri="http://schemas.openxmlformats.org/drawingml/2006/picture">
                 <pic:pic>
                   <pic:nvPicPr>
-                    <pic:cNvPr id="0" name="eda_duration_analysis.png"/>
+                    <pic:cNvPr id="0" name="eda_balance_distribution.png"/>
                     <pic:cNvPicPr/>
                   </pic:nvPicPr>
                   <pic:blipFill>
@@ -2579,7 +2637,7 @@
           <w:color w:val="64748B"/>
           <w:sz w:val="18"/>
         </w:rPr>
-        <w:t>Figure 8: Call Duration Distribution (Post-Contact Exploration)</w:t>
+        <w:t>Figure 8: Account Balance Distribution by Subscription Status</w:t>
       </w:r>
     </w:p>
     <w:p>
@@ -2592,7 +2650,262 @@
           <w:color w:val="1E293B"/>
           <w:sz w:val="21"/>
         </w:rPr>
-        <w:t>Figure 8 shows that subscribed calls averaged 9.2 minutes (555 seconds) versus 3.7 minutes (221 seconds) for non-subscribers. While this association is strong, call length is established only during the interaction. Utilizing duration in prospective targeting models represents severe data leakage, as discussed in Chapter 16.</w:t>
+        <w:t>Figure 8 depicts the yearly average account balance across subscription outcomes. Subscribed clients displayed higher median balances (EUR 733 vs EUR 417) and larger upper-quartile reserves. Customers maintaining negative or negligible bank balances possess minimal discretionary savings.</w:t>
+      </w:r>
+    </w:p>
+    <w:p>
+      <w:pPr>
+        <w:pStyle w:val="Heading2"/>
+        <w:keepNext/>
+        <w:spacing w:before="240" w:after="80"/>
+      </w:pPr>
+      <w:r>
+        <w:rPr>
+          <w:rFonts w:ascii="Arial" w:hAnsi="Arial"/>
+          <w:b/>
+          <w:color w:val="0F766E"/>
+          <w:sz w:val="25"/>
+        </w:rPr>
+        <w:t>12.6 Campaign Contact Frequency and Outreach Diminishing Returns</w:t>
+      </w:r>
+    </w:p>
+    <w:p>
+      <w:pPr>
+        <w:keepNext/>
+        <w:spacing w:before="160" w:after="80"/>
+        <w:jc w:val="center"/>
+      </w:pPr>
+      <w:r>
+        <w:drawing>
+          <wp:inline xmlns:a="http://schemas.openxmlformats.org/drawingml/2006/main" xmlns:pic="http://schemas.openxmlformats.org/drawingml/2006/picture">
+            <wp:extent cx="5303520" cy="3314700"/>
+            <wp:docPr id="9" name="Picture 9"/>
+            <wp:cNvGraphicFramePr>
+              <a:graphicFrameLocks noChangeAspect="1"/>
+            </wp:cNvGraphicFramePr>
+            <a:graphic>
+              <a:graphicData uri="http://schemas.openxmlformats.org/drawingml/2006/picture">
+                <pic:pic>
+                  <pic:nvPicPr>
+                    <pic:cNvPr id="0" name="eda_campaign_contacts.png"/>
+                    <pic:cNvPicPr/>
+                  </pic:nvPicPr>
+                  <pic:blipFill>
+                    <a:blip r:embed="rId19"/>
+                    <a:stretch>
+                      <a:fillRect/>
+                    </a:stretch>
+                  </pic:blipFill>
+                  <pic:spPr>
+                    <a:xfrm>
+                      <a:off x="0" y="0"/>
+                      <a:ext cx="5303520" cy="3314700"/>
+                    </a:xfrm>
+                    <a:prstGeom prst="rect"/>
+                  </pic:spPr>
+                </pic:pic>
+              </a:graphicData>
+            </a:graphic>
+          </wp:inline>
+        </w:drawing>
+      </w:r>
+    </w:p>
+    <w:p>
+      <w:pPr>
+        <w:spacing w:after="240"/>
+        <w:jc w:val="center"/>
+      </w:pPr>
+      <w:r>
+        <w:rPr>
+          <w:rFonts w:ascii="Arial" w:hAnsi="Arial"/>
+          <w:i/>
+          <w:color w:val="64748B"/>
+          <w:sz w:val="18"/>
+        </w:rPr>
+        <w:t>Figure 9: Subscription Rate by Number of Campaign Contacts</w:t>
+      </w:r>
+    </w:p>
+    <w:p>
+      <w:pPr>
+        <w:spacing w:after="120" w:line="276" w:lineRule="auto"/>
+      </w:pPr>
+      <w:r>
+        <w:rPr>
+          <w:rFonts w:ascii="Arial" w:hAnsi="Arial"/>
+          <w:color w:val="1E293B"/>
+          <w:sz w:val="21"/>
+        </w:rPr>
+        <w:t>Figure 9 illustrates sharp diminishing returns associated with repeated calling. Conversion is highest during the 1st contact (12.3%) and 2nd contact (11.5%), before dropping to under 6% for 5-6 contacts and under 3% beyond 7 contacts. High call frequencies produce customer resistance.</w:t>
+      </w:r>
+    </w:p>
+    <w:p>
+      <w:pPr>
+        <w:pStyle w:val="Heading2"/>
+        <w:keepNext/>
+        <w:spacing w:before="240" w:after="80"/>
+      </w:pPr>
+      <w:r>
+        <w:rPr>
+          <w:rFonts w:ascii="Arial" w:hAnsi="Arial"/>
+          <w:b/>
+          <w:color w:val="0F766E"/>
+          <w:sz w:val="25"/>
+        </w:rPr>
+        <w:t>12.7 Previous Campaign Outcome</w:t>
+      </w:r>
+    </w:p>
+    <w:p>
+      <w:pPr>
+        <w:keepNext/>
+        <w:spacing w:before="160" w:after="80"/>
+        <w:jc w:val="center"/>
+      </w:pPr>
+      <w:r>
+        <w:drawing>
+          <wp:inline xmlns:a="http://schemas.openxmlformats.org/drawingml/2006/main" xmlns:pic="http://schemas.openxmlformats.org/drawingml/2006/picture">
+            <wp:extent cx="5303520" cy="3788229"/>
+            <wp:docPr id="10" name="Picture 10"/>
+            <wp:cNvGraphicFramePr>
+              <a:graphicFrameLocks noChangeAspect="1"/>
+            </wp:cNvGraphicFramePr>
+            <a:graphic>
+              <a:graphicData uri="http://schemas.openxmlformats.org/drawingml/2006/picture">
+                <pic:pic>
+                  <pic:nvPicPr>
+                    <pic:cNvPr id="0" name="eda_poutcome_subscription.png"/>
+                    <pic:cNvPicPr/>
+                  </pic:nvPicPr>
+                  <pic:blipFill>
+                    <a:blip r:embed="rId20"/>
+                    <a:stretch>
+                      <a:fillRect/>
+                    </a:stretch>
+                  </pic:blipFill>
+                  <pic:spPr>
+                    <a:xfrm>
+                      <a:off x="0" y="0"/>
+                      <a:ext cx="5303520" cy="3788229"/>
+                    </a:xfrm>
+                    <a:prstGeom prst="rect"/>
+                  </pic:spPr>
+                </pic:pic>
+              </a:graphicData>
+            </a:graphic>
+          </wp:inline>
+        </w:drawing>
+      </w:r>
+    </w:p>
+    <w:p>
+      <w:pPr>
+        <w:spacing w:after="240"/>
+        <w:jc w:val="center"/>
+      </w:pPr>
+      <w:r>
+        <w:rPr>
+          <w:rFonts w:ascii="Arial" w:hAnsi="Arial"/>
+          <w:i/>
+          <w:color w:val="64748B"/>
+          <w:sz w:val="18"/>
+        </w:rPr>
+        <w:t>Figure 10: Subscription Rate by Previous Campaign Outcome</w:t>
+      </w:r>
+    </w:p>
+    <w:p>
+      <w:pPr>
+        <w:spacing w:after="120" w:line="276" w:lineRule="auto"/>
+      </w:pPr>
+      <w:r>
+        <w:rPr>
+          <w:rFonts w:ascii="Arial" w:hAnsi="Arial"/>
+          <w:color w:val="1E293B"/>
+          <w:sz w:val="21"/>
+        </w:rPr>
+        <w:t>Figure 10 demonstrates that customers whose previous campaign outcome was recorded as 'success' achieved an extraordinary current subscription rate of 64.3% - nearly 6 times the baseline rate. Historical positive engagement is the single strongest indicator of prospective conversion.</w:t>
+      </w:r>
+    </w:p>
+    <w:p>
+      <w:pPr>
+        <w:pStyle w:val="Heading2"/>
+        <w:keepNext/>
+        <w:spacing w:before="240" w:after="80"/>
+      </w:pPr>
+      <w:r>
+        <w:rPr>
+          <w:rFonts w:ascii="Arial" w:hAnsi="Arial"/>
+          <w:b/>
+          <w:color w:val="0F766E"/>
+          <w:sz w:val="25"/>
+        </w:rPr>
+        <w:t>12.8 Duration Analysis and Post-Contact Characteristic</w:t>
+      </w:r>
+    </w:p>
+    <w:p>
+      <w:pPr>
+        <w:keepNext/>
+        <w:spacing w:before="160" w:after="80"/>
+        <w:jc w:val="center"/>
+      </w:pPr>
+      <w:r>
+        <w:drawing>
+          <wp:inline xmlns:a="http://schemas.openxmlformats.org/drawingml/2006/main" xmlns:pic="http://schemas.openxmlformats.org/drawingml/2006/picture">
+            <wp:extent cx="5303520" cy="3314700"/>
+            <wp:docPr id="11" name="Picture 11"/>
+            <wp:cNvGraphicFramePr>
+              <a:graphicFrameLocks noChangeAspect="1"/>
+            </wp:cNvGraphicFramePr>
+            <a:graphic>
+              <a:graphicData uri="http://schemas.openxmlformats.org/drawingml/2006/picture">
+                <pic:pic>
+                  <pic:nvPicPr>
+                    <pic:cNvPr id="0" name="eda_duration_analysis.png"/>
+                    <pic:cNvPicPr/>
+                  </pic:nvPicPr>
+                  <pic:blipFill>
+                    <a:blip r:embed="rId21"/>
+                    <a:stretch>
+                      <a:fillRect/>
+                    </a:stretch>
+                  </pic:blipFill>
+                  <pic:spPr>
+                    <a:xfrm>
+                      <a:off x="0" y="0"/>
+                      <a:ext cx="5303520" cy="3314700"/>
+                    </a:xfrm>
+                    <a:prstGeom prst="rect"/>
+                  </pic:spPr>
+                </pic:pic>
+              </a:graphicData>
+            </a:graphic>
+          </wp:inline>
+        </w:drawing>
+      </w:r>
+    </w:p>
+    <w:p>
+      <w:pPr>
+        <w:spacing w:after="240"/>
+        <w:jc w:val="center"/>
+      </w:pPr>
+      <w:r>
+        <w:rPr>
+          <w:rFonts w:ascii="Arial" w:hAnsi="Arial"/>
+          <w:i/>
+          <w:color w:val="64748B"/>
+          <w:sz w:val="18"/>
+        </w:rPr>
+        <w:t>Figure 11: Call Duration Distribution (Post-Contact Exploration)</w:t>
+      </w:r>
+    </w:p>
+    <w:p>
+      <w:pPr>
+        <w:spacing w:after="120" w:line="276" w:lineRule="auto"/>
+      </w:pPr>
+      <w:r>
+        <w:rPr>
+          <w:rFonts w:ascii="Arial" w:hAnsi="Arial"/>
+          <w:color w:val="1E293B"/>
+          <w:sz w:val="21"/>
+        </w:rPr>
+        <w:t>Figure 11 shows that subscribed calls averaged 9.2 minutes (555 seconds) versus 3.7 minutes (221 seconds) for non-subscribers. While this association is strong, call length is established only during the interaction. Utilizing duration in prospective targeting models represents severe data leakage, as discussed in Chapter 16.</w:t>
       </w:r>
     </w:p>
     <w:p>
@@ -2608,7 +2921,7 @@
           <w:color w:val="1E3A8A"/>
           <w:sz w:val="30"/>
         </w:rPr>
-        <w:t>12. Business KPI Analysis</w:t>
+        <w:t>13. Business KPI Analysis</w:t>
       </w:r>
     </w:p>
     <w:p>
@@ -3070,7 +3383,7 @@
           <w:color w:val="1E3A8A"/>
           <w:sz w:val="30"/>
         </w:rPr>
-        <w:t>13. Feature Engineering</w:t>
+        <w:t>14. Feature Engineering</w:t>
       </w:r>
     </w:p>
     <w:p>
@@ -3129,7 +3442,7 @@
           <w:color w:val="334155"/>
           <w:sz w:val="20"/>
         </w:rPr>
-        <w:t xml:space="preserve"> Categorized into Negative (&lt;€0), Low (€0-500), Medium (€501-2000), and High (&gt;€2000) to separate debt-stressed clients from affluent savers without assuming linear returns on balance.</w:t>
+        <w:t xml:space="preserve"> Categorized into Negative (&lt; EUR 0), Low (EUR 0-500), Medium (EUR 501-2000), and High (&gt; EUR 2000) to separate debt-stressed clients from affluent savers without assuming linear returns on balance.</w:t>
       </w:r>
     </w:p>
     <w:p>
@@ -3191,7 +3504,7 @@
           <w:color w:val="1E3A8A"/>
           <w:sz w:val="30"/>
         </w:rPr>
-        <w:t>14. Machine Learning Methodology</w:t>
+        <w:t>15. Machine Learning Methodology</w:t>
       </w:r>
     </w:p>
     <w:p>
@@ -3219,7 +3532,7 @@
           <w:color w:val="0F172A"/>
           <w:sz w:val="20"/>
         </w:rPr>
-        <w:t>Model 1 — Logistic Regression:</w:t>
+        <w:t>Model 1 - Logistic Regression:</w:t>
       </w:r>
       <w:r>
         <w:rPr>
@@ -3242,7 +3555,7 @@
           <w:color w:val="0F172A"/>
           <w:sz w:val="20"/>
         </w:rPr>
-        <w:t>Model 2 — Random Forest Classifier:</w:t>
+        <w:t>Model 2 - Random Forest Classifier:</w:t>
       </w:r>
       <w:r>
         <w:rPr>
@@ -3266,7 +3579,7 @@
           <w:color w:val="1E3A8A"/>
           <w:sz w:val="30"/>
         </w:rPr>
-        <w:t>15. Data Leakage Consideration</w:t>
+        <w:t>16. Data Leakage Consideration</w:t>
       </w:r>
     </w:p>
     <w:p>
@@ -3292,7 +3605,7 @@
         <w:drawing>
           <wp:inline xmlns:a="http://schemas.openxmlformats.org/drawingml/2006/main" xmlns:pic="http://schemas.openxmlformats.org/drawingml/2006/picture">
             <wp:extent cx="5303520" cy="4167051"/>
-            <wp:docPr id="9" name="Picture 9"/>
+            <wp:docPr id="12" name="Picture 12"/>
             <wp:cNvGraphicFramePr>
               <a:graphicFrameLocks noChangeAspect="1"/>
             </wp:cNvGraphicFramePr>
@@ -3304,7 +3617,7 @@
                     <pic:cNvPicPr/>
                   </pic:nvPicPr>
                   <pic:blipFill>
-                    <a:blip r:embed="rId19"/>
+                    <a:blip r:embed="rId22"/>
                     <a:stretch>
                       <a:fillRect/>
                     </a:stretch>
@@ -3335,7 +3648,7 @@
           <w:color w:val="64748B"/>
           <w:sz w:val="18"/>
         </w:rPr>
-        <w:t>Figure 9: ROC Performance Demonstration — With vs Without Duration Leakage</w:t>
+        <w:t>Figure 12: ROC Performance Demonstration - With vs Without Duration Leakage</w:t>
       </w:r>
     </w:p>
     <w:tbl>
@@ -3735,7 +4048,7 @@
           <w:color w:val="1E293B"/>
           <w:sz w:val="21"/>
         </w:rPr>
-        <w:t>As documented in Table 3 and Figure 9, including duration inflates the ROC-AUC to 0.8959. However, this model is operationally invalid because talk time cannot be supplied as an input when prioritizing leads before dialing. Excluding duration yields a valid, realistic ROC-AUC of 0.7185.</w:t>
+        <w:t>As documented in Table 3 and Figure 12, including duration inflates the ROC-AUC to 0.8959. However, this model is operationally invalid because talk time cannot be supplied as an input when prioritizing leads before dialing. Excluding duration yields a valid, realistic ROC-AUC of 0.7185.</w:t>
       </w:r>
     </w:p>
     <w:p>
@@ -3751,7 +4064,7 @@
           <w:color w:val="1E3A8A"/>
           <w:sz w:val="30"/>
         </w:rPr>
-        <w:t>16. Model Evaluation</w:t>
+        <w:t>17. Model Evaluation</w:t>
       </w:r>
     </w:p>
     <w:p>
@@ -3777,7 +4090,7 @@
         <w:drawing>
           <wp:inline xmlns:a="http://schemas.openxmlformats.org/drawingml/2006/main" xmlns:pic="http://schemas.openxmlformats.org/drawingml/2006/picture">
             <wp:extent cx="5303520" cy="4419600"/>
-            <wp:docPr id="10" name="Picture 10"/>
+            <wp:docPr id="13" name="Picture 13"/>
             <wp:cNvGraphicFramePr>
               <a:graphicFrameLocks noChangeAspect="1"/>
             </wp:cNvGraphicFramePr>
@@ -3789,7 +4102,7 @@
                     <pic:cNvPicPr/>
                   </pic:nvPicPr>
                   <pic:blipFill>
-                    <a:blip r:embed="rId20"/>
+                    <a:blip r:embed="rId23"/>
                     <a:stretch>
                       <a:fillRect/>
                     </a:stretch>
@@ -3820,7 +4133,7 @@
           <w:color w:val="64748B"/>
           <w:sz w:val="18"/>
         </w:rPr>
-        <w:t>Figure 10: Confusion Matrix — Logistic Regression (Pre-Contact)</w:t>
+        <w:t>Figure 13: Confusion Matrix - Logistic Regression (Pre-Contact)</w:t>
       </w:r>
     </w:p>
     <w:p>
@@ -3833,7 +4146,7 @@
         <w:drawing>
           <wp:inline xmlns:a="http://schemas.openxmlformats.org/drawingml/2006/main" xmlns:pic="http://schemas.openxmlformats.org/drawingml/2006/picture">
             <wp:extent cx="5303520" cy="4419600"/>
-            <wp:docPr id="11" name="Picture 11"/>
+            <wp:docPr id="14" name="Picture 14"/>
             <wp:cNvGraphicFramePr>
               <a:graphicFrameLocks noChangeAspect="1"/>
             </wp:cNvGraphicFramePr>
@@ -3845,7 +4158,7 @@
                     <pic:cNvPicPr/>
                   </pic:nvPicPr>
                   <pic:blipFill>
-                    <a:blip r:embed="rId21"/>
+                    <a:blip r:embed="rId24"/>
                     <a:stretch>
                       <a:fillRect/>
                     </a:stretch>
@@ -3876,7 +4189,7 @@
           <w:color w:val="64748B"/>
           <w:sz w:val="18"/>
         </w:rPr>
-        <w:t>Figure 11: Confusion Matrix — Random Forest (Pre-Contact)</w:t>
+        <w:t>Figure 14: Confusion Matrix - Random Forest (Pre-Contact)</w:t>
       </w:r>
     </w:p>
     <w:p>
@@ -3889,7 +4202,7 @@
         <w:drawing>
           <wp:inline xmlns:a="http://schemas.openxmlformats.org/drawingml/2006/main" xmlns:pic="http://schemas.openxmlformats.org/drawingml/2006/picture">
             <wp:extent cx="5303520" cy="4167051"/>
-            <wp:docPr id="12" name="Picture 12"/>
+            <wp:docPr id="15" name="Picture 15"/>
             <wp:cNvGraphicFramePr>
               <a:graphicFrameLocks noChangeAspect="1"/>
             </wp:cNvGraphicFramePr>
@@ -3901,7 +4214,7 @@
                     <pic:cNvPicPr/>
                   </pic:nvPicPr>
                   <pic:blipFill>
-                    <a:blip r:embed="rId22"/>
+                    <a:blip r:embed="rId25"/>
                     <a:stretch>
                       <a:fillRect/>
                     </a:stretch>
@@ -3932,7 +4245,7 @@
           <w:color w:val="64748B"/>
           <w:sz w:val="18"/>
         </w:rPr>
-        <w:t>Figure 12: Receiver Operating Characteristic (ROC) Comparison (No Duration)</w:t>
+        <w:t>Figure 15: Receiver Operating Characteristic (ROC) Comparison (No Duration)</w:t>
       </w:r>
     </w:p>
     <w:tbl>
@@ -4335,7 +4648,7 @@
           <w:color w:val="1E3A8A"/>
           <w:sz w:val="30"/>
         </w:rPr>
-        <w:t>17. Results and Discussion</w:t>
+        <w:t>18. Results and Discussion</w:t>
       </w:r>
     </w:p>
     <w:p>
@@ -4410,7 +4723,7 @@
           <w:color w:val="0F766E"/>
           <w:sz w:val="25"/>
         </w:rPr>
-        <w:t>17.1 Feature Importance and Model Interpretation</w:t>
+        <w:t>18.1 Feature Importance and Model Interpretation</w:t>
       </w:r>
     </w:p>
     <w:p>
@@ -4423,7 +4736,7 @@
         <w:drawing>
           <wp:inline xmlns:a="http://schemas.openxmlformats.org/drawingml/2006/main" xmlns:pic="http://schemas.openxmlformats.org/drawingml/2006/picture">
             <wp:extent cx="5303520" cy="3535680"/>
-            <wp:docPr id="13" name="Picture 13"/>
+            <wp:docPr id="16" name="Picture 16"/>
             <wp:cNvGraphicFramePr>
               <a:graphicFrameLocks noChangeAspect="1"/>
             </wp:cNvGraphicFramePr>
@@ -4435,7 +4748,7 @@
                     <pic:cNvPicPr/>
                   </pic:nvPicPr>
                   <pic:blipFill>
-                    <a:blip r:embed="rId23"/>
+                    <a:blip r:embed="rId26"/>
                     <a:stretch>
                       <a:fillRect/>
                     </a:stretch>
@@ -4466,7 +4779,7 @@
           <w:color w:val="64748B"/>
           <w:sz w:val="18"/>
         </w:rPr>
-        <w:t>Figure 13: Top 15 Feature Importances — Random Forest</w:t>
+        <w:t>Figure 16: Top 15 Feature Importances - Random Forest</w:t>
       </w:r>
     </w:p>
     <w:p>
@@ -4479,7 +4792,7 @@
         <w:drawing>
           <wp:inline xmlns:a="http://schemas.openxmlformats.org/drawingml/2006/main" xmlns:pic="http://schemas.openxmlformats.org/drawingml/2006/picture">
             <wp:extent cx="5303520" cy="3535680"/>
-            <wp:docPr id="14" name="Picture 14"/>
+            <wp:docPr id="17" name="Picture 17"/>
             <wp:cNvGraphicFramePr>
               <a:graphicFrameLocks noChangeAspect="1"/>
             </wp:cNvGraphicFramePr>
@@ -4491,7 +4804,7 @@
                     <pic:cNvPicPr/>
                   </pic:nvPicPr>
                   <pic:blipFill>
-                    <a:blip r:embed="rId24"/>
+                    <a:blip r:embed="rId27"/>
                     <a:stretch>
                       <a:fillRect/>
                     </a:stretch>
@@ -4522,7 +4835,7 @@
           <w:color w:val="64748B"/>
           <w:sz w:val="18"/>
         </w:rPr>
-        <w:t>Figure 14: Most Influential Coefficients — Logistic Regression</w:t>
+        <w:t>Figure 17: Most Influential Coefficients - Logistic Regression</w:t>
       </w:r>
     </w:p>
     <w:p>
@@ -4535,7 +4848,7 @@
           <w:color w:val="1E293B"/>
           <w:sz w:val="21"/>
         </w:rPr>
-        <w:t>Figure 13 and Figure 14 highlight the driving variables. In the Random Forest model, continuous financial features (balance, age, day, campaign) and previous campaign success (poutcome_success) contribute most to Gini impurity reduction. In Logistic Regression, poutcome_success (+1.86 log-odds) is the single strongest positive predictor, while existing housing loans (-0.51 log-odds) and personal debt (-0.57 log-odds) exert the strongest downward pressure on subscription likelihood.</w:t>
+        <w:t>Figure 16 and Figure 17 highlight the driving variables. In the Random Forest model, continuous financial features (balance, age, day, campaign) and previous campaign success (poutcome_success) contribute most to Gini impurity reduction. In Logistic Regression, poutcome_success (+1.86 log-odds) is the single strongest positive predictor, while existing housing loans (-0.51 log-odds) and personal debt (-0.57 log-odds) exert the strongest downward pressure on subscription likelihood.</w:t>
       </w:r>
     </w:p>
     <w:p>
@@ -4551,7 +4864,7 @@
           <w:color w:val="1E3A8A"/>
           <w:sz w:val="30"/>
         </w:rPr>
-        <w:t>18. Business Insights</w:t>
+        <w:t>19. Business Insights</w:t>
       </w:r>
     </w:p>
     <w:p>
@@ -4659,7 +4972,7 @@
           <w:color w:val="1E3A8A"/>
           <w:sz w:val="30"/>
         </w:rPr>
-        <w:t>19. Business Recommendations</w:t>
+        <w:t>20. Business Recommendations</w:t>
       </w:r>
     </w:p>
     <w:p>
@@ -4790,7 +5103,7 @@
           <w:color w:val="1E3A8A"/>
           <w:sz w:val="30"/>
         </w:rPr>
-        <w:t>20. Limitations</w:t>
+        <w:t>21. Limitations</w:t>
       </w:r>
     </w:p>
     <w:p>
@@ -4898,7 +5211,7 @@
           <w:color w:val="1E3A8A"/>
           <w:sz w:val="30"/>
         </w:rPr>
-        <w:t>21. Future Scope</w:t>
+        <w:t>22. Future Scope</w:t>
       </w:r>
     </w:p>
     <w:p>
@@ -5006,7 +5319,7 @@
           <w:color w:val="1E3A8A"/>
           <w:sz w:val="30"/>
         </w:rPr>
-        <w:t>22. Conclusion</w:t>
+        <w:t>23. Conclusion</w:t>
       </w:r>
     </w:p>
     <w:p>
@@ -5035,7 +5348,7 @@
           <w:color w:val="1E3A8A"/>
           <w:sz w:val="30"/>
         </w:rPr>
-        <w:t>23. References</w:t>
+        <w:t>24. References</w:t>
       </w:r>
     </w:p>
     <w:p>
@@ -5197,7 +5510,7 @@
         <w:color w:val="787878"/>
         <w:sz w:val="17"/>
       </w:rPr>
-      <w:t>AICTE | IBM SkillsBuild Internship 2026 — Bank Campaign Analytics</w:t>
+      <w:t>AICTE | IBM SkillsBuild Internship 2026 - Bank Campaign Analytics</w:t>
     </w:r>
   </w:p>
 </w:hdr>

</xml_diff>